<commit_message>
eliminado pantalla de carga, y ajustado link de redireccion
</commit_message>
<xml_diff>
--- a/src/lib/circuitos/Santander Expedición Aventurera.docx
+++ b/src/lib/circuitos/Santander Expedición Aventurera.docx
@@ -1,6 +1,6 @@
 
 <file path=word/document.xml><?xml version="1.0" encoding="utf-8"?>
-<w:document xmlns:wpc="http://schemas.microsoft.com/office/word/2010/wordprocessingCanvas" xmlns:cx="http://schemas.microsoft.com/office/drawing/2014/chartex" xmlns:cx1="http://schemas.microsoft.com/office/drawing/2015/9/8/chartex" xmlns:cx2="http://schemas.microsoft.com/office/drawing/2015/10/21/chartex" xmlns:cx3="http://schemas.microsoft.com/office/drawing/2016/5/9/chartex" xmlns:cx4="http://schemas.microsoft.com/office/drawing/2016/5/10/chartex" xmlns:cx5="http://schemas.microsoft.com/office/drawing/2016/5/11/chartex" xmlns:cx6="http://schemas.microsoft.com/office/drawing/2016/5/12/chartex" xmlns:cx7="http://schemas.microsoft.com/office/drawing/2016/5/13/chartex" xmlns:cx8="http://schemas.microsoft.com/office/drawing/2016/5/14/chartex" xmlns:mc="http://schemas.openxmlformats.org/markup-compatibility/2006" xmlns:aink="http://schemas.microsoft.com/office/drawing/2016/ink" xmlns:am3d="http://schemas.microsoft.com/office/drawing/2017/model3d" xmlns:o="urn:schemas-microsoft-com:office:office" xmlns:oel="http://schemas.microsoft.com/office/2019/extlst" xmlns:r="http://schemas.openxmlformats.org/officeDocument/2006/relationships" xmlns:m="http://schemas.openxmlformats.org/officeDocument/2006/math" xmlns:v="urn:schemas-microsoft-com:vml" xmlns:wp14="http://schemas.microsoft.com/office/word/2010/wordprocessingDrawing" xmlns:wp="http://schemas.openxmlformats.org/drawingml/2006/wordprocessingDrawing" xmlns:w10="urn:schemas-microsoft-com:office:word" xmlns:w="http://schemas.openxmlformats.org/wordprocessingml/2006/main" xmlns:w14="http://schemas.microsoft.com/office/word/2010/wordml" xmlns:w15="http://schemas.microsoft.com/office/word/2012/wordml" xmlns:w16cex="http://schemas.microsoft.com/office/word/2018/wordml/cex" xmlns:w16cid="http://schemas.microsoft.com/office/word/2016/wordml/cid" xmlns:w16="http://schemas.microsoft.com/office/word/2018/wordml" xmlns:w16du="http://schemas.microsoft.com/office/word/2023/wordml/word16du" xmlns:w16sdtdh="http://schemas.microsoft.com/office/word/2020/wordml/sdtdatahash" xmlns:w16sdtfl="http://schemas.microsoft.com/office/word/2024/wordml/sdtformatlock" xmlns:w16se="http://schemas.microsoft.com/office/word/2015/wordml/symex" xmlns:wpg="http://schemas.microsoft.com/office/word/2010/wordprocessingGroup" xmlns:wpi="http://schemas.microsoft.com/office/word/2010/wordprocessingInk" xmlns:wne="http://schemas.microsoft.com/office/word/2006/wordml" xmlns:wps="http://schemas.microsoft.com/office/word/2010/wordprocessingShape" mc:Ignorable="w14 w15 w16se w16cid w16 w16cex w16sdtdh w16sdtfl w16du wp14">
+<w:document xmlns:wpc="http://schemas.microsoft.com/office/word/2010/wordprocessingCanvas" xmlns:cx="http://schemas.microsoft.com/office/drawing/2014/chartex" xmlns:cx1="http://schemas.microsoft.com/office/drawing/2015/9/8/chartex" xmlns:cx2="http://schemas.microsoft.com/office/drawing/2015/10/21/chartex" xmlns:cx3="http://schemas.microsoft.com/office/drawing/2016/5/9/chartex" xmlns:cx4="http://schemas.microsoft.com/office/drawing/2016/5/10/chartex" xmlns:cx5="http://schemas.microsoft.com/office/drawing/2016/5/11/chartex" xmlns:cx6="http://schemas.microsoft.com/office/drawing/2016/5/12/chartex" xmlns:cx7="http://schemas.microsoft.com/office/drawing/2016/5/13/chartex" xmlns:cx8="http://schemas.microsoft.com/office/drawing/2016/5/14/chartex" xmlns:mc="http://schemas.openxmlformats.org/markup-compatibility/2006" xmlns:aink="http://schemas.microsoft.com/office/drawing/2016/ink" xmlns:am3d="http://schemas.microsoft.com/office/drawing/2017/model3d" xmlns:o="urn:schemas-microsoft-com:office:office" xmlns:r="http://schemas.openxmlformats.org/officeDocument/2006/relationships" xmlns:m="http://schemas.openxmlformats.org/officeDocument/2006/math" xmlns:v="urn:schemas-microsoft-com:vml" xmlns:wp14="http://schemas.microsoft.com/office/word/2010/wordprocessingDrawing" xmlns:wp="http://schemas.openxmlformats.org/drawingml/2006/wordprocessingDrawing" xmlns:w10="urn:schemas-microsoft-com:office:word" xmlns:w="http://schemas.openxmlformats.org/wordprocessingml/2006/main" xmlns:w14="http://schemas.microsoft.com/office/word/2010/wordml" xmlns:w15="http://schemas.microsoft.com/office/word/2012/wordml" xmlns:w16cex="http://schemas.microsoft.com/office/word/2018/wordml/cex" xmlns:w16cid="http://schemas.microsoft.com/office/word/2016/wordml/cid" xmlns:w16="http://schemas.microsoft.com/office/word/2018/wordml" xmlns:w16sdtdh="http://schemas.microsoft.com/office/word/2020/wordml/sdtdatahash" xmlns:w16se="http://schemas.microsoft.com/office/word/2015/wordml/symex" xmlns:wpg="http://schemas.microsoft.com/office/word/2010/wordprocessingGroup" xmlns:wpi="http://schemas.microsoft.com/office/word/2010/wordprocessingInk" xmlns:wne="http://schemas.microsoft.com/office/word/2006/wordml" xmlns:wps="http://schemas.microsoft.com/office/word/2010/wordprocessingShape" mc:Ignorable="w14 w15 w16se w16cid w16 w16cex w16sdtdh wp14">
   <w:body>
     <w:p>
       <w:r>
@@ -1450,18 +1450,7 @@
           <w:szCs w:val="26"/>
           <w:lang w:eastAsia="es-CO"/>
         </w:rPr>
-        <w:t xml:space="preserve"> 4 </w:t>
-      </w:r>
-      <w:r>
-        <w:rPr>
-          <w:rFonts w:ascii="Calibri" w:eastAsia="Times New Roman" w:hAnsi="Calibri" w:cs="Calibri"/>
-          <w:b/>
-          <w:color w:val="000000"/>
-          <w:sz w:val="26"/>
-          <w:szCs w:val="26"/>
-          <w:lang w:eastAsia="es-CO"/>
-        </w:rPr>
-        <w:t>BOGOTÁ</w:t>
+        <w:t xml:space="preserve"> 4 BOGOTÁ</w:t>
       </w:r>
       <w:r>
         <w:rPr>
@@ -1563,51 +1552,7 @@
           <w:szCs w:val="26"/>
           <w:lang w:eastAsia="es-CO"/>
         </w:rPr>
-        <w:t xml:space="preserve"> recorrido por sus calles empedradas y sus puentes de calicanto </w:t>
-      </w:r>
-      <w:r>
-        <w:rPr>
-          <w:rFonts w:ascii="Calibri" w:eastAsia="Times New Roman" w:hAnsi="Calibri" w:cs="Calibri"/>
-          <w:bCs/>
-          <w:color w:val="000000"/>
-          <w:sz w:val="26"/>
-          <w:szCs w:val="26"/>
-          <w:lang w:eastAsia="es-CO"/>
-        </w:rPr>
-        <w:t>así</w:t>
-      </w:r>
-      <w:r>
-        <w:rPr>
-          <w:rFonts w:ascii="Calibri" w:eastAsia="Times New Roman" w:hAnsi="Calibri" w:cs="Calibri"/>
-          <w:bCs/>
-          <w:color w:val="000000"/>
-          <w:sz w:val="26"/>
-          <w:szCs w:val="26"/>
-          <w:lang w:eastAsia="es-CO"/>
-        </w:rPr>
-        <w:t xml:space="preserve"> como la </w:t>
-      </w:r>
-      <w:r>
-        <w:rPr>
-          <w:rFonts w:ascii="Calibri" w:eastAsia="Times New Roman" w:hAnsi="Calibri" w:cs="Calibri"/>
-          <w:bCs/>
-          <w:color w:val="000000"/>
-          <w:sz w:val="26"/>
-          <w:szCs w:val="26"/>
-          <w:lang w:eastAsia="es-CO"/>
-        </w:rPr>
-        <w:t>Basílica</w:t>
-      </w:r>
-      <w:r>
-        <w:rPr>
-          <w:rFonts w:ascii="Calibri" w:eastAsia="Times New Roman" w:hAnsi="Calibri" w:cs="Calibri"/>
-          <w:bCs/>
-          <w:color w:val="000000"/>
-          <w:sz w:val="26"/>
-          <w:szCs w:val="26"/>
-          <w:lang w:eastAsia="es-CO"/>
-        </w:rPr>
-        <w:t xml:space="preserve"> </w:t>
+        <w:t xml:space="preserve"> recorrido por sus calles empedradas y sus puentes de calicanto así como la Basílica </w:t>
       </w:r>
       <w:r>
         <w:rPr>
@@ -1629,29 +1574,7 @@
           <w:szCs w:val="26"/>
           <w:lang w:eastAsia="es-CO"/>
         </w:rPr>
-        <w:t xml:space="preserve">enor de San Juan Bautista y su casco antiguo que nos transportara a la </w:t>
-      </w:r>
-      <w:r>
-        <w:rPr>
-          <w:rFonts w:ascii="Calibri" w:eastAsia="Times New Roman" w:hAnsi="Calibri" w:cs="Calibri"/>
-          <w:bCs/>
-          <w:color w:val="000000"/>
-          <w:sz w:val="26"/>
-          <w:szCs w:val="26"/>
-          <w:lang w:eastAsia="es-CO"/>
-        </w:rPr>
-        <w:t>época</w:t>
-      </w:r>
-      <w:r>
-        <w:rPr>
-          <w:rFonts w:ascii="Calibri" w:eastAsia="Times New Roman" w:hAnsi="Calibri" w:cs="Calibri"/>
-          <w:bCs/>
-          <w:color w:val="000000"/>
-          <w:sz w:val="26"/>
-          <w:szCs w:val="26"/>
-          <w:lang w:eastAsia="es-CO"/>
-        </w:rPr>
-        <w:t xml:space="preserve"> de la colonia, en horas de la tarde entrega de habitaciones </w:t>
+        <w:t xml:space="preserve">enor de San Juan Bautista y su casco antiguo que nos transportara a la época de la colonia, en horas de la tarde entrega de habitaciones </w:t>
       </w:r>
       <w:r>
         <w:rPr>
@@ -3805,17 +3728,7 @@
           <w:szCs w:val="26"/>
           <w:lang w:eastAsia="es-CO"/>
         </w:rPr>
-        <w:t>9</w:t>
-      </w:r>
-      <w:r>
-        <w:rPr>
-          <w:rFonts w:eastAsia="Times New Roman" w:cstheme="minorHAnsi"/>
-          <w:color w:val="39302A"/>
-          <w:sz w:val="26"/>
-          <w:szCs w:val="26"/>
-          <w:lang w:eastAsia="es-CO"/>
-        </w:rPr>
-        <w:t xml:space="preserve"> desayunos e impuestos hoteleros </w:t>
+        <w:t xml:space="preserve">9 desayunos e impuestos hoteleros </w:t>
       </w:r>
     </w:p>
     <w:p>
@@ -3845,17 +3758,7 @@
           <w:szCs w:val="26"/>
           <w:lang w:eastAsia="es-CO"/>
         </w:rPr>
-        <w:t>9</w:t>
-      </w:r>
-      <w:r>
-        <w:rPr>
-          <w:rFonts w:eastAsia="Times New Roman" w:cstheme="minorHAnsi"/>
-          <w:color w:val="39302A"/>
-          <w:sz w:val="26"/>
-          <w:szCs w:val="26"/>
-          <w:lang w:eastAsia="es-CO"/>
-        </w:rPr>
-        <w:t xml:space="preserve"> almuerzos </w:t>
+        <w:t xml:space="preserve">9 almuerzos </w:t>
       </w:r>
     </w:p>
     <w:p>
@@ -4446,71 +4349,7 @@
           <w:sz w:val="26"/>
           <w:szCs w:val="26"/>
         </w:rPr>
-        <w:t xml:space="preserve">Guía de Idioma Inglés, </w:t>
-      </w:r>
-      <w:r>
-        <w:rPr>
-          <w:rFonts w:ascii="Calibri" w:eastAsia="Calibri" w:hAnsi="Calibri" w:cs="Calibri"/>
-          <w:sz w:val="26"/>
-          <w:szCs w:val="26"/>
-        </w:rPr>
-        <w:t>francés</w:t>
-      </w:r>
-      <w:r>
-        <w:rPr>
-          <w:rFonts w:ascii="Calibri" w:eastAsia="Calibri" w:hAnsi="Calibri" w:cs="Calibri"/>
-          <w:sz w:val="26"/>
-          <w:szCs w:val="26"/>
-        </w:rPr>
-        <w:t>,</w:t>
-      </w:r>
-      <w:r>
-        <w:rPr>
-          <w:rFonts w:ascii="Calibri" w:eastAsia="Calibri" w:hAnsi="Calibri" w:cs="Calibri"/>
-          <w:sz w:val="26"/>
-          <w:szCs w:val="26"/>
-        </w:rPr>
-        <w:t xml:space="preserve"> alemán</w:t>
-      </w:r>
-      <w:r>
-        <w:rPr>
-          <w:rFonts w:ascii="Calibri" w:eastAsia="Calibri" w:hAnsi="Calibri" w:cs="Calibri"/>
-          <w:sz w:val="26"/>
-          <w:szCs w:val="26"/>
-        </w:rPr>
-        <w:t>,</w:t>
-      </w:r>
-      <w:r>
-        <w:rPr>
-          <w:rFonts w:ascii="Calibri" w:eastAsia="Calibri" w:hAnsi="Calibri" w:cs="Calibri"/>
-          <w:sz w:val="26"/>
-          <w:szCs w:val="26"/>
-        </w:rPr>
-        <w:t xml:space="preserve"> </w:t>
-      </w:r>
-      <w:r>
-        <w:rPr>
-          <w:rFonts w:ascii="Calibri" w:eastAsia="Calibri" w:hAnsi="Calibri" w:cs="Calibri"/>
-          <w:sz w:val="26"/>
-          <w:szCs w:val="26"/>
-        </w:rPr>
-        <w:t xml:space="preserve">Japones, </w:t>
-      </w:r>
-      <w:r>
-        <w:rPr>
-          <w:rFonts w:ascii="Calibri" w:eastAsia="Calibri" w:hAnsi="Calibri" w:cs="Calibri"/>
-          <w:sz w:val="26"/>
-          <w:szCs w:val="26"/>
-        </w:rPr>
-        <w:t>mandarín</w:t>
-      </w:r>
-      <w:r>
-        <w:rPr>
-          <w:rFonts w:ascii="Calibri" w:eastAsia="Calibri" w:hAnsi="Calibri" w:cs="Calibri"/>
-          <w:sz w:val="26"/>
-          <w:szCs w:val="26"/>
-        </w:rPr>
-        <w:t xml:space="preserve"> requiere Suplemento a pagar en destino.</w:t>
+        <w:t>Guía de Idioma Inglés, francés, alemán, Japones, mandarín requiere Suplemento a pagar en destino.</w:t>
       </w:r>
     </w:p>
     <w:p>
@@ -6217,12 +6056,16 @@
       </w:r>
     </w:p>
     <w:p/>
+    <w:p>
+      <w:r>
+        <w:t xml:space="preserve"> </w:t>
+      </w:r>
+    </w:p>
     <w:p/>
     <w:p/>
     <w:p/>
     <w:p/>
     <w:p/>
-    <w:p/>
     <w:p>
       <w:pPr>
         <w:spacing w:after="200"/>
@@ -6241,8 +6084,35 @@
           <w:sz w:val="26"/>
           <w:szCs w:val="26"/>
         </w:rPr>
+        <w:t>CONDICIONES GENERALES</w:t>
+      </w:r>
+    </w:p>
+    <w:p>
+      <w:pPr>
+        <w:spacing w:after="200"/>
+        <w:jc w:val="both"/>
+        <w:rPr>
+          <w:b/>
+          <w:sz w:val="26"/>
+          <w:szCs w:val="26"/>
+        </w:rPr>
+      </w:pPr>
+      <w:r>
+        <w:rPr>
+          <w:b/>
+          <w:bCs/>
+          <w:sz w:val="26"/>
+          <w:szCs w:val="26"/>
+        </w:rPr>
         <w:lastRenderedPageBreak/>
-        <w:t>CONDICIONES GENERALES</w:t>
+        <w:t xml:space="preserve">DEPOSITOS: </w:t>
+      </w:r>
+      <w:r>
+        <w:rPr>
+          <w:sz w:val="26"/>
+          <w:szCs w:val="26"/>
+        </w:rPr>
+        <w:t>Debido a la alta demanda hotelera, ON TOUR SAS AGENCIA DE VIAJES OPERADORA, podrá solicitar depósitos no reembolsables para garantizar reservas. En el caso que los plazos no se cumplan, las reservas serán automáticamente anuladas. En el caso que quieran reactivar dichas reservas, intentaremos, pasando las nuevas condiciones.</w:t>
       </w:r>
     </w:p>
     <w:p>
@@ -6262,14 +6132,46 @@
           <w:sz w:val="26"/>
           <w:szCs w:val="26"/>
         </w:rPr>
-        <w:t xml:space="preserve">DEPOSITOS: </w:t>
-      </w:r>
-      <w:r>
-        <w:rPr>
-          <w:sz w:val="26"/>
-          <w:szCs w:val="26"/>
-        </w:rPr>
-        <w:t>Debido a la alta demanda hotelera, ON TOUR SAS AGENCIA DE VIAJES OPERADORA, podrá solicitar depósitos no reembolsables para garantizar reservas. En el caso que los plazos no se cumplan, las reservas serán automáticamente anuladas. En el caso que quieran reactivar dichas reservas, intentaremos, pasando las nuevas condiciones.</w:t>
+        <w:t>CANCELACIONES/CAMBIOS/REEBOLSO:</w:t>
+      </w:r>
+      <w:r>
+        <w:rPr>
+          <w:sz w:val="26"/>
+          <w:szCs w:val="26"/>
+        </w:rPr>
+        <w:t xml:space="preserve"> Las cancelaciones deben hacerse por escrito (e-mail / fax / carta), cancelaciones verbales no serán aceptadas. ON TOUR SAS AGENCIA DE VIAJES OPERADORA, cargaran al agente comprador cualquier gasto en que incurra perdida de depósitos para hoteles, </w:t>
+      </w:r>
+      <w:proofErr w:type="spellStart"/>
+      <w:r>
+        <w:rPr>
+          <w:sz w:val="26"/>
+          <w:szCs w:val="26"/>
+        </w:rPr>
+        <w:t>etc</w:t>
+      </w:r>
+      <w:proofErr w:type="spellEnd"/>
+      <w:r>
+        <w:rPr>
+          <w:sz w:val="26"/>
+          <w:szCs w:val="26"/>
+        </w:rPr>
+        <w:t xml:space="preserve">, por pasajeros posteriores cancelados, además se incluirá el gasto operacional correspondiente (comunicaciones, administrativos razonables, </w:t>
+      </w:r>
+      <w:proofErr w:type="spellStart"/>
+      <w:r>
+        <w:rPr>
+          <w:sz w:val="26"/>
+          <w:szCs w:val="26"/>
+        </w:rPr>
+        <w:t>etc</w:t>
+      </w:r>
+      <w:proofErr w:type="spellEnd"/>
+      <w:r>
+        <w:rPr>
+          <w:sz w:val="26"/>
+          <w:szCs w:val="26"/>
+        </w:rPr>
+        <w:t>). En el caso de pasajeros con derecho a devoluciones por servicios no prestados o cancelados dentro de los plazos fijados, ON TOUR SAS AGENCIA DE VIAJES OPERADORA harán dichos reembolsos exclusivamente a través del agente comprador. Reclamos de REEMBOLSOS DESPUES DE LOS 40 DIAS NO SERAN RECONOCIDOS. Sin Excepción.</w:t>
       </w:r>
     </w:p>
     <w:p>
@@ -6289,14 +6191,97 @@
           <w:sz w:val="26"/>
           <w:szCs w:val="26"/>
         </w:rPr>
-        <w:t>CANCELACIONES/CAMBIOS/REEBOLSO:</w:t>
-      </w:r>
-      <w:r>
-        <w:rPr>
-          <w:sz w:val="26"/>
-          <w:szCs w:val="26"/>
-        </w:rPr>
-        <w:t xml:space="preserve"> Las cancelaciones deben hacerse por escrito (e-mail / fax / carta), cancelaciones verbales no serán aceptadas. ON TOUR SAS AGENCIA DE VIAJES OPERADORA, cargaran al agente comprador cualquier gasto en que incurra perdida de depósitos para hoteles, </w:t>
+        <w:t>CANCELACIONES/CAMBIOS HECHOS POR LOS PASAJEROS:</w:t>
+      </w:r>
+      <w:r>
+        <w:rPr>
+          <w:sz w:val="26"/>
+          <w:szCs w:val="26"/>
+        </w:rPr>
+        <w:t xml:space="preserve"> En el caso que el pasajero cancele servicios y/o hoteles estando de viaje, es importante que obtenga del operador u hotel un número de cancelación. No será aceptado nombre de un empleado, se requiere un número de cancelación que sea VALIDO. En todos los casos nos reservamos el derecho de cobrar un cargo por los cambios hechos. </w:t>
+      </w:r>
+    </w:p>
+    <w:p>
+      <w:pPr>
+        <w:spacing w:after="200"/>
+        <w:jc w:val="both"/>
+        <w:rPr>
+          <w:sz w:val="26"/>
+          <w:szCs w:val="26"/>
+        </w:rPr>
+      </w:pPr>
+      <w:r>
+        <w:rPr>
+          <w:b/>
+          <w:bCs/>
+          <w:sz w:val="26"/>
+          <w:szCs w:val="26"/>
+        </w:rPr>
+        <w:t>NO SHOW:</w:t>
+      </w:r>
+      <w:r>
+        <w:rPr>
+          <w:sz w:val="26"/>
+          <w:szCs w:val="26"/>
+        </w:rPr>
+        <w:t xml:space="preserve"> En caso de que el cliente no se presente, el servicio será considerado prestado. No tendrá derecho a devolución. Cambios hechos fuera del tiempo indicado por cada hotel están sujetos a un cargo equivalente a 01 noche de hotel como mínimo. Parques Nacionales: Una vez enviado el prepago por hotel solicitado, no existe devolución. En caso de que el hotel solicitado este completo, un hotel similar será reservado en cuyo caso debemos recibir aceptación en 48 horas máximo; caso contrario la reserva será cancelada. </w:t>
+      </w:r>
+    </w:p>
+    <w:p>
+      <w:pPr>
+        <w:spacing w:after="200"/>
+        <w:jc w:val="both"/>
+        <w:rPr>
+          <w:sz w:val="26"/>
+          <w:szCs w:val="26"/>
+        </w:rPr>
+      </w:pPr>
+    </w:p>
+    <w:p>
+      <w:pPr>
+        <w:spacing w:after="200"/>
+        <w:jc w:val="both"/>
+        <w:rPr>
+          <w:sz w:val="26"/>
+          <w:szCs w:val="26"/>
+        </w:rPr>
+      </w:pPr>
+    </w:p>
+    <w:p>
+      <w:pPr>
+        <w:spacing w:after="200"/>
+        <w:jc w:val="both"/>
+        <w:rPr>
+          <w:b/>
+          <w:sz w:val="26"/>
+          <w:szCs w:val="26"/>
+        </w:rPr>
+      </w:pPr>
+      <w:r>
+        <w:rPr>
+          <w:sz w:val="26"/>
+          <w:szCs w:val="26"/>
+        </w:rPr>
+        <w:t xml:space="preserve">Servicios no utilizados: Reclamos deberán ser acompañados de documentación completa y son sujetos a un cargo determinado de acuerdo al destino y producto. </w:t>
+      </w:r>
+    </w:p>
+    <w:p>
+      <w:pPr>
+        <w:spacing w:after="200"/>
+        <w:jc w:val="both"/>
+        <w:rPr>
+          <w:b/>
+          <w:sz w:val="26"/>
+          <w:szCs w:val="26"/>
+        </w:rPr>
+      </w:pPr>
+      <w:r>
+        <w:rPr>
+          <w:sz w:val="26"/>
+          <w:szCs w:val="26"/>
+        </w:rPr>
+        <w:lastRenderedPageBreak/>
+        <w:t xml:space="preserve">Entradas de teatro, espectáculos, funciones, deportes, </w:t>
       </w:r>
       <w:proofErr w:type="spellStart"/>
       <w:r>
@@ -6312,23 +6297,7 @@
           <w:sz w:val="26"/>
           <w:szCs w:val="26"/>
         </w:rPr>
-        <w:t xml:space="preserve">, por pasajeros posteriores cancelados, además se incluirá el gasto operacional correspondiente (comunicaciones, administrativos razonables, </w:t>
-      </w:r>
-      <w:proofErr w:type="spellStart"/>
-      <w:r>
-        <w:rPr>
-          <w:sz w:val="26"/>
-          <w:szCs w:val="26"/>
-        </w:rPr>
-        <w:t>etc</w:t>
-      </w:r>
-      <w:proofErr w:type="spellEnd"/>
-      <w:r>
-        <w:rPr>
-          <w:sz w:val="26"/>
-          <w:szCs w:val="26"/>
-        </w:rPr>
-        <w:t>). En el caso de pasajeros con derecho a devoluciones por servicios no prestados o cancelados dentro de los plazos fijados, ON TOUR SAS AGENCIA DE VIAJES OPERADORA harán dichos reembolsos exclusivamente a través del agente comprador. Reclamos de REEMBOLSOS DESPUES DE LOS 40 DIAS NO SERAN RECONOCIDOS. Sin Excepción.</w:t>
+        <w:t xml:space="preserve">, no son reembolsables. Los gastos de NO SHOW deberán ser pagos dentro de los términos de la facturación, en el caso que no se paguen, reservamos el derecho de no aceptar reservas futuras hasta recibir pago. </w:t>
       </w:r>
     </w:p>
     <w:p>
@@ -6348,183 +6317,6 @@
           <w:sz w:val="26"/>
           <w:szCs w:val="26"/>
         </w:rPr>
-        <w:t>CANCELACIONES/CAMBIOS HECHOS POR LOS PASAJEROS:</w:t>
-      </w:r>
-      <w:r>
-        <w:rPr>
-          <w:sz w:val="26"/>
-          <w:szCs w:val="26"/>
-        </w:rPr>
-        <w:t xml:space="preserve"> En el caso que el pasajero cancele servicios y/o hoteles estando de viaje, es importante que obtenga del operador u hotel un número de cancelación. No será aceptado nombre de un empleado, se requiere un número de cancelación que sea VALIDO. En todos los casos nos reservamos el derecho de cobrar un cargo por los cambios hechos. </w:t>
-      </w:r>
-    </w:p>
-    <w:p>
-      <w:pPr>
-        <w:spacing w:after="200"/>
-        <w:jc w:val="both"/>
-        <w:rPr>
-          <w:sz w:val="26"/>
-          <w:szCs w:val="26"/>
-        </w:rPr>
-      </w:pPr>
-      <w:r>
-        <w:rPr>
-          <w:b/>
-          <w:bCs/>
-          <w:sz w:val="26"/>
-          <w:szCs w:val="26"/>
-        </w:rPr>
-        <w:t xml:space="preserve">NO </w:t>
-      </w:r>
-      <w:proofErr w:type="gramStart"/>
-      <w:r>
-        <w:rPr>
-          <w:b/>
-          <w:bCs/>
-          <w:sz w:val="26"/>
-          <w:szCs w:val="26"/>
-        </w:rPr>
-        <w:t>SHOW</w:t>
-      </w:r>
-      <w:proofErr w:type="gramEnd"/>
-      <w:r>
-        <w:rPr>
-          <w:b/>
-          <w:bCs/>
-          <w:sz w:val="26"/>
-          <w:szCs w:val="26"/>
-        </w:rPr>
-        <w:t>:</w:t>
-      </w:r>
-      <w:r>
-        <w:rPr>
-          <w:sz w:val="26"/>
-          <w:szCs w:val="26"/>
-        </w:rPr>
-        <w:t xml:space="preserve"> En caso de que el cliente no se presente, el servicio será considerado prestado. No tendrá derecho a devolución. Cambios hechos fuera del tiempo indicado por cada hotel están sujetos a un cargo equivalente a 01 noche de hotel como mínimo. Parques Nacionales: Una vez enviado el prepago por hotel solicitado, no existe devolución. En caso de que el hotel solicitado este completo, un hotel similar será reservado en cuyo caso debemos recibir aceptación en 48 horas máximo; caso contrario la reserva será cancelada. </w:t>
-      </w:r>
-    </w:p>
-    <w:p>
-      <w:pPr>
-        <w:spacing w:after="200"/>
-        <w:jc w:val="both"/>
-        <w:rPr>
-          <w:sz w:val="26"/>
-          <w:szCs w:val="26"/>
-        </w:rPr>
-      </w:pPr>
-    </w:p>
-    <w:p>
-      <w:pPr>
-        <w:spacing w:after="200"/>
-        <w:jc w:val="both"/>
-        <w:rPr>
-          <w:sz w:val="26"/>
-          <w:szCs w:val="26"/>
-        </w:rPr>
-      </w:pPr>
-    </w:p>
-    <w:p>
-      <w:pPr>
-        <w:spacing w:after="200"/>
-        <w:jc w:val="both"/>
-        <w:rPr>
-          <w:b/>
-          <w:sz w:val="26"/>
-          <w:szCs w:val="26"/>
-        </w:rPr>
-      </w:pPr>
-      <w:r>
-        <w:rPr>
-          <w:sz w:val="26"/>
-          <w:szCs w:val="26"/>
-        </w:rPr>
-        <w:t xml:space="preserve">Servicios no utilizados: Reclamos deberán ser acompañados de documentación completa y son sujetos a un cargo determinado </w:t>
-      </w:r>
-      <w:proofErr w:type="gramStart"/>
-      <w:r>
-        <w:rPr>
-          <w:sz w:val="26"/>
-          <w:szCs w:val="26"/>
-        </w:rPr>
-        <w:t>de acuerdo al</w:t>
-      </w:r>
-      <w:proofErr w:type="gramEnd"/>
-      <w:r>
-        <w:rPr>
-          <w:sz w:val="26"/>
-          <w:szCs w:val="26"/>
-        </w:rPr>
-        <w:t xml:space="preserve"> destino y producto. </w:t>
-      </w:r>
-    </w:p>
-    <w:p>
-      <w:pPr>
-        <w:spacing w:after="200"/>
-        <w:jc w:val="both"/>
-        <w:rPr>
-          <w:b/>
-          <w:sz w:val="26"/>
-          <w:szCs w:val="26"/>
-        </w:rPr>
-      </w:pPr>
-      <w:r>
-        <w:rPr>
-          <w:sz w:val="26"/>
-          <w:szCs w:val="26"/>
-        </w:rPr>
-        <w:t xml:space="preserve">Entradas de teatro, espectáculos, funciones, deportes, </w:t>
-      </w:r>
-      <w:proofErr w:type="spellStart"/>
-      <w:r>
-        <w:rPr>
-          <w:sz w:val="26"/>
-          <w:szCs w:val="26"/>
-        </w:rPr>
-        <w:t>etc</w:t>
-      </w:r>
-      <w:proofErr w:type="spellEnd"/>
-      <w:r>
-        <w:rPr>
-          <w:sz w:val="26"/>
-          <w:szCs w:val="26"/>
-        </w:rPr>
-        <w:t xml:space="preserve">, no son reembolsables. Los gastos de NO </w:t>
-      </w:r>
-      <w:proofErr w:type="gramStart"/>
-      <w:r>
-        <w:rPr>
-          <w:sz w:val="26"/>
-          <w:szCs w:val="26"/>
-        </w:rPr>
-        <w:t>SHOW</w:t>
-      </w:r>
-      <w:proofErr w:type="gramEnd"/>
-      <w:r>
-        <w:rPr>
-          <w:sz w:val="26"/>
-          <w:szCs w:val="26"/>
-        </w:rPr>
-        <w:t xml:space="preserve"> deberán ser pagos dentro de los términos de la facturación, en el caso que no se paguen, reservamos el derecho de no aceptar reservas futuras hasta recibir pago. </w:t>
-      </w:r>
-    </w:p>
-    <w:p>
-      <w:pPr>
-        <w:spacing w:after="200"/>
-        <w:jc w:val="both"/>
-        <w:rPr>
-          <w:b/>
-          <w:sz w:val="26"/>
-          <w:szCs w:val="26"/>
-        </w:rPr>
-      </w:pPr>
-      <w:r>
-        <w:rPr>
-          <w:b/>
-          <w:bCs/>
-          <w:sz w:val="26"/>
-          <w:szCs w:val="26"/>
-        </w:rPr>
         <w:t>NOTA:</w:t>
       </w:r>
       <w:r>
@@ -6532,23 +6324,7 @@
           <w:sz w:val="26"/>
           <w:szCs w:val="26"/>
         </w:rPr>
-        <w:t xml:space="preserve"> Los gastos de NO </w:t>
-      </w:r>
-      <w:proofErr w:type="gramStart"/>
-      <w:r>
-        <w:rPr>
-          <w:sz w:val="26"/>
-          <w:szCs w:val="26"/>
-        </w:rPr>
-        <w:t>SHOW</w:t>
-      </w:r>
-      <w:proofErr w:type="gramEnd"/>
-      <w:r>
-        <w:rPr>
-          <w:sz w:val="26"/>
-          <w:szCs w:val="26"/>
-        </w:rPr>
-        <w:t xml:space="preserve"> deberán ser pagos dentro de los términos de la facturación, en el caso que no se paguen, reservamos el derecho de no aceptar futuras reservas hasta recibir pago.</w:t>
+        <w:t xml:space="preserve"> Los gastos de NO SHOW deberán ser pagos dentro de los términos de la facturación, en el caso que no se paguen, reservamos el derecho de no aceptar futuras reservas hasta recibir pago.</w:t>
       </w:r>
     </w:p>
     <w:p>
@@ -6713,7 +6489,15 @@
           <w:sz w:val="26"/>
           <w:szCs w:val="26"/>
         </w:rPr>
-        <w:t>cumplimiento de la Resolución 3860/15 sobre sostenibilidad turística. La responsabilidad del organizador del plan o paquete turístico se limita a los términos y condiciones del programa en relación con la prestación y calidad de los servicios. La Agencia no asume ninguna responsabilidad frente al usuario por el servicio de transporte aéreo, salvo que se trate de vuelo fletado y de acuerdo con las condiciones del contrato de transporte. La agencia no asume responsabilidad frente al usuario o viajero por eventos de fuerza mayor o caso fortuito, acción u omisión de terceros o del viajero que pudiere ocurrir antes o durante el viaje. Toda la información adicional relativa a vigencias, condiciones, penalidades, políticas de cancelación y reembolso, tarifas, impuestos, y demás pagos obligatorios, medidas de salud, documentación, servicios de asistencia, deben ser consultados con el asesor de viajes, así mismo serán informados al pasajero en los documentos de viaje, según las características que apliquen a cada uno.</w:t>
+        <w:t xml:space="preserve">cumplimiento de la Resolución 3860/15 sobre sostenibilidad turística. La responsabilidad del organizador del plan o paquete turístico se limita a los términos y condiciones del programa en relación con la prestación y calidad de los servicios. </w:t>
+      </w:r>
+      <w:r>
+        <w:rPr>
+          <w:sz w:val="26"/>
+          <w:szCs w:val="26"/>
+        </w:rPr>
+        <w:lastRenderedPageBreak/>
+        <w:t>La Agencia no asume ninguna responsabilidad frente al usuario por el servicio de transporte aéreo, salvo que se trate de vuelo fletado y de acuerdo con las condiciones del contrato de transporte. La agencia no asume responsabilidad frente al usuario o viajero por eventos de fuerza mayor o caso fortuito, acción u omisión de terceros o del viajero que pudiere ocurrir antes o durante el viaje. Toda la información adicional relativa a vigencias, condiciones, penalidades, políticas de cancelación y reembolso, tarifas, impuestos, y demás pagos obligatorios, medidas de salud, documentación, servicios de asistencia, deben ser consultados con el asesor de viajes, así mismo serán informados al pasajero en los documentos de viaje, según las características que apliquen a cada uno.</w:t>
       </w:r>
     </w:p>
     <w:p>
@@ -6863,7 +6647,7 @@
 </file>
 
 <file path=word/endnotes.xml><?xml version="1.0" encoding="utf-8"?>
-<w:endnotes xmlns:wpc="http://schemas.microsoft.com/office/word/2010/wordprocessingCanvas" xmlns:cx="http://schemas.microsoft.com/office/drawing/2014/chartex" xmlns:cx1="http://schemas.microsoft.com/office/drawing/2015/9/8/chartex" xmlns:cx2="http://schemas.microsoft.com/office/drawing/2015/10/21/chartex" xmlns:cx3="http://schemas.microsoft.com/office/drawing/2016/5/9/chartex" xmlns:cx4="http://schemas.microsoft.com/office/drawing/2016/5/10/chartex" xmlns:cx5="http://schemas.microsoft.com/office/drawing/2016/5/11/chartex" xmlns:cx6="http://schemas.microsoft.com/office/drawing/2016/5/12/chartex" xmlns:cx7="http://schemas.microsoft.com/office/drawing/2016/5/13/chartex" xmlns:cx8="http://schemas.microsoft.com/office/drawing/2016/5/14/chartex" xmlns:mc="http://schemas.openxmlformats.org/markup-compatibility/2006" xmlns:aink="http://schemas.microsoft.com/office/drawing/2016/ink" xmlns:am3d="http://schemas.microsoft.com/office/drawing/2017/model3d" xmlns:o="urn:schemas-microsoft-com:office:office" xmlns:oel="http://schemas.microsoft.com/office/2019/extlst" xmlns:r="http://schemas.openxmlformats.org/officeDocument/2006/relationships" xmlns:m="http://schemas.openxmlformats.org/officeDocument/2006/math" xmlns:v="urn:schemas-microsoft-com:vml" xmlns:wp14="http://schemas.microsoft.com/office/word/2010/wordprocessingDrawing" xmlns:wp="http://schemas.openxmlformats.org/drawingml/2006/wordprocessingDrawing" xmlns:w10="urn:schemas-microsoft-com:office:word" xmlns:w="http://schemas.openxmlformats.org/wordprocessingml/2006/main" xmlns:w14="http://schemas.microsoft.com/office/word/2010/wordml" xmlns:w15="http://schemas.microsoft.com/office/word/2012/wordml" xmlns:w16cex="http://schemas.microsoft.com/office/word/2018/wordml/cex" xmlns:w16cid="http://schemas.microsoft.com/office/word/2016/wordml/cid" xmlns:w16="http://schemas.microsoft.com/office/word/2018/wordml" xmlns:w16du="http://schemas.microsoft.com/office/word/2023/wordml/word16du" xmlns:w16sdtdh="http://schemas.microsoft.com/office/word/2020/wordml/sdtdatahash" xmlns:w16sdtfl="http://schemas.microsoft.com/office/word/2024/wordml/sdtformatlock" xmlns:w16se="http://schemas.microsoft.com/office/word/2015/wordml/symex" xmlns:wpg="http://schemas.microsoft.com/office/word/2010/wordprocessingGroup" xmlns:wpi="http://schemas.microsoft.com/office/word/2010/wordprocessingInk" xmlns:wne="http://schemas.microsoft.com/office/word/2006/wordml" xmlns:wps="http://schemas.microsoft.com/office/word/2010/wordprocessingShape" mc:Ignorable="w14 w15 w16se w16cid w16 w16cex w16sdtdh w16sdtfl w16du wp14">
+<w:endnotes xmlns:wpc="http://schemas.microsoft.com/office/word/2010/wordprocessingCanvas" xmlns:cx="http://schemas.microsoft.com/office/drawing/2014/chartex" xmlns:cx1="http://schemas.microsoft.com/office/drawing/2015/9/8/chartex" xmlns:cx2="http://schemas.microsoft.com/office/drawing/2015/10/21/chartex" xmlns:cx3="http://schemas.microsoft.com/office/drawing/2016/5/9/chartex" xmlns:cx4="http://schemas.microsoft.com/office/drawing/2016/5/10/chartex" xmlns:cx5="http://schemas.microsoft.com/office/drawing/2016/5/11/chartex" xmlns:cx6="http://schemas.microsoft.com/office/drawing/2016/5/12/chartex" xmlns:cx7="http://schemas.microsoft.com/office/drawing/2016/5/13/chartex" xmlns:cx8="http://schemas.microsoft.com/office/drawing/2016/5/14/chartex" xmlns:mc="http://schemas.openxmlformats.org/markup-compatibility/2006" xmlns:aink="http://schemas.microsoft.com/office/drawing/2016/ink" xmlns:am3d="http://schemas.microsoft.com/office/drawing/2017/model3d" xmlns:o="urn:schemas-microsoft-com:office:office" xmlns:r="http://schemas.openxmlformats.org/officeDocument/2006/relationships" xmlns:m="http://schemas.openxmlformats.org/officeDocument/2006/math" xmlns:v="urn:schemas-microsoft-com:vml" xmlns:wp14="http://schemas.microsoft.com/office/word/2010/wordprocessingDrawing" xmlns:wp="http://schemas.openxmlformats.org/drawingml/2006/wordprocessingDrawing" xmlns:w10="urn:schemas-microsoft-com:office:word" xmlns:w="http://schemas.openxmlformats.org/wordprocessingml/2006/main" xmlns:w14="http://schemas.microsoft.com/office/word/2010/wordml" xmlns:w15="http://schemas.microsoft.com/office/word/2012/wordml" xmlns:w16cex="http://schemas.microsoft.com/office/word/2018/wordml/cex" xmlns:w16cid="http://schemas.microsoft.com/office/word/2016/wordml/cid" xmlns:w16="http://schemas.microsoft.com/office/word/2018/wordml" xmlns:w16sdtdh="http://schemas.microsoft.com/office/word/2020/wordml/sdtdatahash" xmlns:w16se="http://schemas.microsoft.com/office/word/2015/wordml/symex" xmlns:wpg="http://schemas.microsoft.com/office/word/2010/wordprocessingGroup" xmlns:wpi="http://schemas.microsoft.com/office/word/2010/wordprocessingInk" xmlns:wne="http://schemas.microsoft.com/office/word/2006/wordml" xmlns:wps="http://schemas.microsoft.com/office/word/2010/wordprocessingShape" mc:Ignorable="w14 w15 w16se w16cid w16 w16cex w16sdtdh wp14">
   <w:endnote w:type="separator" w:id="-1">
     <w:p>
       <w:pPr>
@@ -6888,7 +6672,7 @@
 </file>
 
 <file path=word/footer1.xml><?xml version="1.0" encoding="utf-8"?>
-<w:ftr xmlns:wpc="http://schemas.microsoft.com/office/word/2010/wordprocessingCanvas" xmlns:cx="http://schemas.microsoft.com/office/drawing/2014/chartex" xmlns:cx1="http://schemas.microsoft.com/office/drawing/2015/9/8/chartex" xmlns:cx2="http://schemas.microsoft.com/office/drawing/2015/10/21/chartex" xmlns:cx3="http://schemas.microsoft.com/office/drawing/2016/5/9/chartex" xmlns:cx4="http://schemas.microsoft.com/office/drawing/2016/5/10/chartex" xmlns:cx5="http://schemas.microsoft.com/office/drawing/2016/5/11/chartex" xmlns:cx6="http://schemas.microsoft.com/office/drawing/2016/5/12/chartex" xmlns:cx7="http://schemas.microsoft.com/office/drawing/2016/5/13/chartex" xmlns:cx8="http://schemas.microsoft.com/office/drawing/2016/5/14/chartex" xmlns:mc="http://schemas.openxmlformats.org/markup-compatibility/2006" xmlns:aink="http://schemas.microsoft.com/office/drawing/2016/ink" xmlns:am3d="http://schemas.microsoft.com/office/drawing/2017/model3d" xmlns:o="urn:schemas-microsoft-com:office:office" xmlns:oel="http://schemas.microsoft.com/office/2019/extlst" xmlns:r="http://schemas.openxmlformats.org/officeDocument/2006/relationships" xmlns:m="http://schemas.openxmlformats.org/officeDocument/2006/math" xmlns:v="urn:schemas-microsoft-com:vml" xmlns:wp14="http://schemas.microsoft.com/office/word/2010/wordprocessingDrawing" xmlns:wp="http://schemas.openxmlformats.org/drawingml/2006/wordprocessingDrawing" xmlns:w10="urn:schemas-microsoft-com:office:word" xmlns:w="http://schemas.openxmlformats.org/wordprocessingml/2006/main" xmlns:w14="http://schemas.microsoft.com/office/word/2010/wordml" xmlns:w15="http://schemas.microsoft.com/office/word/2012/wordml" xmlns:w16cex="http://schemas.microsoft.com/office/word/2018/wordml/cex" xmlns:w16cid="http://schemas.microsoft.com/office/word/2016/wordml/cid" xmlns:w16="http://schemas.microsoft.com/office/word/2018/wordml" xmlns:w16du="http://schemas.microsoft.com/office/word/2023/wordml/word16du" xmlns:w16sdtdh="http://schemas.microsoft.com/office/word/2020/wordml/sdtdatahash" xmlns:w16sdtfl="http://schemas.microsoft.com/office/word/2024/wordml/sdtformatlock" xmlns:w16se="http://schemas.microsoft.com/office/word/2015/wordml/symex" xmlns:wpg="http://schemas.microsoft.com/office/word/2010/wordprocessingGroup" xmlns:wpi="http://schemas.microsoft.com/office/word/2010/wordprocessingInk" xmlns:wne="http://schemas.microsoft.com/office/word/2006/wordml" xmlns:wps="http://schemas.microsoft.com/office/word/2010/wordprocessingShape" mc:Ignorable="w14 w15 w16se w16cid w16 w16cex w16sdtdh w16sdtfl w16du wp14">
+<w:ftr xmlns:wpc="http://schemas.microsoft.com/office/word/2010/wordprocessingCanvas" xmlns:cx="http://schemas.microsoft.com/office/drawing/2014/chartex" xmlns:cx1="http://schemas.microsoft.com/office/drawing/2015/9/8/chartex" xmlns:cx2="http://schemas.microsoft.com/office/drawing/2015/10/21/chartex" xmlns:cx3="http://schemas.microsoft.com/office/drawing/2016/5/9/chartex" xmlns:cx4="http://schemas.microsoft.com/office/drawing/2016/5/10/chartex" xmlns:cx5="http://schemas.microsoft.com/office/drawing/2016/5/11/chartex" xmlns:cx6="http://schemas.microsoft.com/office/drawing/2016/5/12/chartex" xmlns:cx7="http://schemas.microsoft.com/office/drawing/2016/5/13/chartex" xmlns:cx8="http://schemas.microsoft.com/office/drawing/2016/5/14/chartex" xmlns:mc="http://schemas.openxmlformats.org/markup-compatibility/2006" xmlns:aink="http://schemas.microsoft.com/office/drawing/2016/ink" xmlns:am3d="http://schemas.microsoft.com/office/drawing/2017/model3d" xmlns:o="urn:schemas-microsoft-com:office:office" xmlns:r="http://schemas.openxmlformats.org/officeDocument/2006/relationships" xmlns:m="http://schemas.openxmlformats.org/officeDocument/2006/math" xmlns:v="urn:schemas-microsoft-com:vml" xmlns:wp14="http://schemas.microsoft.com/office/word/2010/wordprocessingDrawing" xmlns:wp="http://schemas.openxmlformats.org/drawingml/2006/wordprocessingDrawing" xmlns:w10="urn:schemas-microsoft-com:office:word" xmlns:w="http://schemas.openxmlformats.org/wordprocessingml/2006/main" xmlns:w14="http://schemas.microsoft.com/office/word/2010/wordml" xmlns:w15="http://schemas.microsoft.com/office/word/2012/wordml" xmlns:w16cex="http://schemas.microsoft.com/office/word/2018/wordml/cex" xmlns:w16cid="http://schemas.microsoft.com/office/word/2016/wordml/cid" xmlns:w16="http://schemas.microsoft.com/office/word/2018/wordml" xmlns:w16sdtdh="http://schemas.microsoft.com/office/word/2020/wordml/sdtdatahash" xmlns:w16se="http://schemas.microsoft.com/office/word/2015/wordml/symex" xmlns:wpg="http://schemas.microsoft.com/office/word/2010/wordprocessingGroup" xmlns:wpi="http://schemas.microsoft.com/office/word/2010/wordprocessingInk" xmlns:wne="http://schemas.microsoft.com/office/word/2006/wordml" xmlns:wps="http://schemas.microsoft.com/office/word/2010/wordprocessingShape" mc:Ignorable="w14 w15 w16se w16cid w16 w16cex w16sdtdh wp14">
   <w:p>
     <w:pPr>
       <w:pStyle w:val="Piedepgina"/>
@@ -6977,20 +6761,42 @@
         <w:lang w:val="en-US"/>
       </w:rPr>
     </w:pPr>
-    <w:hyperlink r:id="rId1" w:history="1">
-      <w:r>
-        <w:rPr>
-          <w:rStyle w:val="Hipervnculo"/>
-          <w:rFonts w:ascii="Calibri" w:hAnsi="Calibri" w:cs="Calibri"/>
-          <w:b/>
-          <w:bCs/>
-          <w:sz w:val="28"/>
-          <w:szCs w:val="28"/>
-          <w:lang w:val="en-US"/>
-        </w:rPr>
-        <w:t>www.ontourdmc.com</w:t>
-      </w:r>
-    </w:hyperlink>
+    <w:r>
+      <w:fldChar w:fldCharType="begin"/>
+    </w:r>
+    <w:r>
+      <w:rPr>
+        <w:lang w:val="en-GB"/>
+      </w:rPr>
+      <w:instrText xml:space="preserve"> HYPERLINK "http://www.ontourdmc.com" </w:instrText>
+    </w:r>
+    <w:r>
+      <w:fldChar w:fldCharType="separate"/>
+    </w:r>
+    <w:r>
+      <w:rPr>
+        <w:rStyle w:val="Hipervnculo"/>
+        <w:rFonts w:ascii="Calibri" w:hAnsi="Calibri" w:cs="Calibri"/>
+        <w:b/>
+        <w:bCs/>
+        <w:sz w:val="28"/>
+        <w:szCs w:val="28"/>
+        <w:lang w:val="en-US"/>
+      </w:rPr>
+      <w:t>www.ontourdmc.com</w:t>
+    </w:r>
+    <w:r>
+      <w:rPr>
+        <w:rStyle w:val="Hipervnculo"/>
+        <w:rFonts w:ascii="Calibri" w:hAnsi="Calibri" w:cs="Calibri"/>
+        <w:b/>
+        <w:bCs/>
+        <w:sz w:val="28"/>
+        <w:szCs w:val="28"/>
+        <w:lang w:val="en-US"/>
+      </w:rPr>
+      <w:fldChar w:fldCharType="end"/>
+    </w:r>
     <w:r>
       <w:rPr>
         <w:rFonts w:ascii="Calibri" w:hAnsi="Calibri" w:cs="Calibri"/>
@@ -7015,7 +6821,7 @@
 </file>
 
 <file path=word/footnotes.xml><?xml version="1.0" encoding="utf-8"?>
-<w:footnotes xmlns:wpc="http://schemas.microsoft.com/office/word/2010/wordprocessingCanvas" xmlns:cx="http://schemas.microsoft.com/office/drawing/2014/chartex" xmlns:cx1="http://schemas.microsoft.com/office/drawing/2015/9/8/chartex" xmlns:cx2="http://schemas.microsoft.com/office/drawing/2015/10/21/chartex" xmlns:cx3="http://schemas.microsoft.com/office/drawing/2016/5/9/chartex" xmlns:cx4="http://schemas.microsoft.com/office/drawing/2016/5/10/chartex" xmlns:cx5="http://schemas.microsoft.com/office/drawing/2016/5/11/chartex" xmlns:cx6="http://schemas.microsoft.com/office/drawing/2016/5/12/chartex" xmlns:cx7="http://schemas.microsoft.com/office/drawing/2016/5/13/chartex" xmlns:cx8="http://schemas.microsoft.com/office/drawing/2016/5/14/chartex" xmlns:mc="http://schemas.openxmlformats.org/markup-compatibility/2006" xmlns:aink="http://schemas.microsoft.com/office/drawing/2016/ink" xmlns:am3d="http://schemas.microsoft.com/office/drawing/2017/model3d" xmlns:o="urn:schemas-microsoft-com:office:office" xmlns:oel="http://schemas.microsoft.com/office/2019/extlst" xmlns:r="http://schemas.openxmlformats.org/officeDocument/2006/relationships" xmlns:m="http://schemas.openxmlformats.org/officeDocument/2006/math" xmlns:v="urn:schemas-microsoft-com:vml" xmlns:wp14="http://schemas.microsoft.com/office/word/2010/wordprocessingDrawing" xmlns:wp="http://schemas.openxmlformats.org/drawingml/2006/wordprocessingDrawing" xmlns:w10="urn:schemas-microsoft-com:office:word" xmlns:w="http://schemas.openxmlformats.org/wordprocessingml/2006/main" xmlns:w14="http://schemas.microsoft.com/office/word/2010/wordml" xmlns:w15="http://schemas.microsoft.com/office/word/2012/wordml" xmlns:w16cex="http://schemas.microsoft.com/office/word/2018/wordml/cex" xmlns:w16cid="http://schemas.microsoft.com/office/word/2016/wordml/cid" xmlns:w16="http://schemas.microsoft.com/office/word/2018/wordml" xmlns:w16du="http://schemas.microsoft.com/office/word/2023/wordml/word16du" xmlns:w16sdtdh="http://schemas.microsoft.com/office/word/2020/wordml/sdtdatahash" xmlns:w16sdtfl="http://schemas.microsoft.com/office/word/2024/wordml/sdtformatlock" xmlns:w16se="http://schemas.microsoft.com/office/word/2015/wordml/symex" xmlns:wpg="http://schemas.microsoft.com/office/word/2010/wordprocessingGroup" xmlns:wpi="http://schemas.microsoft.com/office/word/2010/wordprocessingInk" xmlns:wne="http://schemas.microsoft.com/office/word/2006/wordml" xmlns:wps="http://schemas.microsoft.com/office/word/2010/wordprocessingShape" mc:Ignorable="w14 w15 w16se w16cid w16 w16cex w16sdtdh w16sdtfl w16du wp14">
+<w:footnotes xmlns:wpc="http://schemas.microsoft.com/office/word/2010/wordprocessingCanvas" xmlns:cx="http://schemas.microsoft.com/office/drawing/2014/chartex" xmlns:cx1="http://schemas.microsoft.com/office/drawing/2015/9/8/chartex" xmlns:cx2="http://schemas.microsoft.com/office/drawing/2015/10/21/chartex" xmlns:cx3="http://schemas.microsoft.com/office/drawing/2016/5/9/chartex" xmlns:cx4="http://schemas.microsoft.com/office/drawing/2016/5/10/chartex" xmlns:cx5="http://schemas.microsoft.com/office/drawing/2016/5/11/chartex" xmlns:cx6="http://schemas.microsoft.com/office/drawing/2016/5/12/chartex" xmlns:cx7="http://schemas.microsoft.com/office/drawing/2016/5/13/chartex" xmlns:cx8="http://schemas.microsoft.com/office/drawing/2016/5/14/chartex" xmlns:mc="http://schemas.openxmlformats.org/markup-compatibility/2006" xmlns:aink="http://schemas.microsoft.com/office/drawing/2016/ink" xmlns:am3d="http://schemas.microsoft.com/office/drawing/2017/model3d" xmlns:o="urn:schemas-microsoft-com:office:office" xmlns:r="http://schemas.openxmlformats.org/officeDocument/2006/relationships" xmlns:m="http://schemas.openxmlformats.org/officeDocument/2006/math" xmlns:v="urn:schemas-microsoft-com:vml" xmlns:wp14="http://schemas.microsoft.com/office/word/2010/wordprocessingDrawing" xmlns:wp="http://schemas.openxmlformats.org/drawingml/2006/wordprocessingDrawing" xmlns:w10="urn:schemas-microsoft-com:office:word" xmlns:w="http://schemas.openxmlformats.org/wordprocessingml/2006/main" xmlns:w14="http://schemas.microsoft.com/office/word/2010/wordml" xmlns:w15="http://schemas.microsoft.com/office/word/2012/wordml" xmlns:w16cex="http://schemas.microsoft.com/office/word/2018/wordml/cex" xmlns:w16cid="http://schemas.microsoft.com/office/word/2016/wordml/cid" xmlns:w16="http://schemas.microsoft.com/office/word/2018/wordml" xmlns:w16sdtdh="http://schemas.microsoft.com/office/word/2020/wordml/sdtdatahash" xmlns:w16se="http://schemas.microsoft.com/office/word/2015/wordml/symex" xmlns:wpg="http://schemas.microsoft.com/office/word/2010/wordprocessingGroup" xmlns:wpi="http://schemas.microsoft.com/office/word/2010/wordprocessingInk" xmlns:wne="http://schemas.microsoft.com/office/word/2006/wordml" xmlns:wps="http://schemas.microsoft.com/office/word/2010/wordprocessingShape" mc:Ignorable="w14 w15 w16se w16cid w16 w16cex w16sdtdh wp14">
   <w:footnote w:type="separator" w:id="-1">
     <w:p>
       <w:pPr>
@@ -7040,7 +6846,7 @@
 </file>
 
 <file path=word/header1.xml><?xml version="1.0" encoding="utf-8"?>
-<w:hdr xmlns:wpc="http://schemas.microsoft.com/office/word/2010/wordprocessingCanvas" xmlns:cx="http://schemas.microsoft.com/office/drawing/2014/chartex" xmlns:cx1="http://schemas.microsoft.com/office/drawing/2015/9/8/chartex" xmlns:cx2="http://schemas.microsoft.com/office/drawing/2015/10/21/chartex" xmlns:cx3="http://schemas.microsoft.com/office/drawing/2016/5/9/chartex" xmlns:cx4="http://schemas.microsoft.com/office/drawing/2016/5/10/chartex" xmlns:cx5="http://schemas.microsoft.com/office/drawing/2016/5/11/chartex" xmlns:cx6="http://schemas.microsoft.com/office/drawing/2016/5/12/chartex" xmlns:cx7="http://schemas.microsoft.com/office/drawing/2016/5/13/chartex" xmlns:cx8="http://schemas.microsoft.com/office/drawing/2016/5/14/chartex" xmlns:mc="http://schemas.openxmlformats.org/markup-compatibility/2006" xmlns:aink="http://schemas.microsoft.com/office/drawing/2016/ink" xmlns:am3d="http://schemas.microsoft.com/office/drawing/2017/model3d" xmlns:o="urn:schemas-microsoft-com:office:office" xmlns:oel="http://schemas.microsoft.com/office/2019/extlst" xmlns:r="http://schemas.openxmlformats.org/officeDocument/2006/relationships" xmlns:m="http://schemas.openxmlformats.org/officeDocument/2006/math" xmlns:v="urn:schemas-microsoft-com:vml" xmlns:wp14="http://schemas.microsoft.com/office/word/2010/wordprocessingDrawing" xmlns:wp="http://schemas.openxmlformats.org/drawingml/2006/wordprocessingDrawing" xmlns:w10="urn:schemas-microsoft-com:office:word" xmlns:w="http://schemas.openxmlformats.org/wordprocessingml/2006/main" xmlns:w14="http://schemas.microsoft.com/office/word/2010/wordml" xmlns:w15="http://schemas.microsoft.com/office/word/2012/wordml" xmlns:w16cex="http://schemas.microsoft.com/office/word/2018/wordml/cex" xmlns:w16cid="http://schemas.microsoft.com/office/word/2016/wordml/cid" xmlns:w16="http://schemas.microsoft.com/office/word/2018/wordml" xmlns:w16du="http://schemas.microsoft.com/office/word/2023/wordml/word16du" xmlns:w16sdtdh="http://schemas.microsoft.com/office/word/2020/wordml/sdtdatahash" xmlns:w16sdtfl="http://schemas.microsoft.com/office/word/2024/wordml/sdtformatlock" xmlns:w16se="http://schemas.microsoft.com/office/word/2015/wordml/symex" xmlns:wpg="http://schemas.microsoft.com/office/word/2010/wordprocessingGroup" xmlns:wpi="http://schemas.microsoft.com/office/word/2010/wordprocessingInk" xmlns:wne="http://schemas.microsoft.com/office/word/2006/wordml" xmlns:wps="http://schemas.microsoft.com/office/word/2010/wordprocessingShape" mc:Ignorable="w14 w15 w16se w16cid w16 w16cex w16sdtdh w16sdtfl w16du wp14">
+<w:hdr xmlns:wpc="http://schemas.microsoft.com/office/word/2010/wordprocessingCanvas" xmlns:cx="http://schemas.microsoft.com/office/drawing/2014/chartex" xmlns:cx1="http://schemas.microsoft.com/office/drawing/2015/9/8/chartex" xmlns:cx2="http://schemas.microsoft.com/office/drawing/2015/10/21/chartex" xmlns:cx3="http://schemas.microsoft.com/office/drawing/2016/5/9/chartex" xmlns:cx4="http://schemas.microsoft.com/office/drawing/2016/5/10/chartex" xmlns:cx5="http://schemas.microsoft.com/office/drawing/2016/5/11/chartex" xmlns:cx6="http://schemas.microsoft.com/office/drawing/2016/5/12/chartex" xmlns:cx7="http://schemas.microsoft.com/office/drawing/2016/5/13/chartex" xmlns:cx8="http://schemas.microsoft.com/office/drawing/2016/5/14/chartex" xmlns:mc="http://schemas.openxmlformats.org/markup-compatibility/2006" xmlns:aink="http://schemas.microsoft.com/office/drawing/2016/ink" xmlns:am3d="http://schemas.microsoft.com/office/drawing/2017/model3d" xmlns:o="urn:schemas-microsoft-com:office:office" xmlns:r="http://schemas.openxmlformats.org/officeDocument/2006/relationships" xmlns:m="http://schemas.openxmlformats.org/officeDocument/2006/math" xmlns:v="urn:schemas-microsoft-com:vml" xmlns:wp14="http://schemas.microsoft.com/office/word/2010/wordprocessingDrawing" xmlns:wp="http://schemas.openxmlformats.org/drawingml/2006/wordprocessingDrawing" xmlns:w10="urn:schemas-microsoft-com:office:word" xmlns:w="http://schemas.openxmlformats.org/wordprocessingml/2006/main" xmlns:w14="http://schemas.microsoft.com/office/word/2010/wordml" xmlns:w15="http://schemas.microsoft.com/office/word/2012/wordml" xmlns:w16cex="http://schemas.microsoft.com/office/word/2018/wordml/cex" xmlns:w16cid="http://schemas.microsoft.com/office/word/2016/wordml/cid" xmlns:w16="http://schemas.microsoft.com/office/word/2018/wordml" xmlns:w16sdtdh="http://schemas.microsoft.com/office/word/2020/wordml/sdtdatahash" xmlns:w16se="http://schemas.microsoft.com/office/word/2015/wordml/symex" xmlns:wpg="http://schemas.microsoft.com/office/word/2010/wordprocessingGroup" xmlns:wpi="http://schemas.microsoft.com/office/word/2010/wordprocessingInk" xmlns:wne="http://schemas.microsoft.com/office/word/2006/wordml" xmlns:wps="http://schemas.microsoft.com/office/word/2010/wordprocessingShape" mc:Ignorable="w14 w15 w16se w16cid w16 w16cex w16sdtdh wp14">
   <w:p>
     <w:pPr>
       <w:pStyle w:val="Encabezado"/>
@@ -7367,7 +7173,7 @@
 </file>
 
 <file path=word/numbering.xml><?xml version="1.0" encoding="utf-8"?>
-<w:numbering xmlns:wpc="http://schemas.microsoft.com/office/word/2010/wordprocessingCanvas" xmlns:cx="http://schemas.microsoft.com/office/drawing/2014/chartex" xmlns:cx1="http://schemas.microsoft.com/office/drawing/2015/9/8/chartex" xmlns:cx2="http://schemas.microsoft.com/office/drawing/2015/10/21/chartex" xmlns:cx3="http://schemas.microsoft.com/office/drawing/2016/5/9/chartex" xmlns:cx4="http://schemas.microsoft.com/office/drawing/2016/5/10/chartex" xmlns:cx5="http://schemas.microsoft.com/office/drawing/2016/5/11/chartex" xmlns:cx6="http://schemas.microsoft.com/office/drawing/2016/5/12/chartex" xmlns:cx7="http://schemas.microsoft.com/office/drawing/2016/5/13/chartex" xmlns:cx8="http://schemas.microsoft.com/office/drawing/2016/5/14/chartex" xmlns:mc="http://schemas.openxmlformats.org/markup-compatibility/2006" xmlns:aink="http://schemas.microsoft.com/office/drawing/2016/ink" xmlns:am3d="http://schemas.microsoft.com/office/drawing/2017/model3d" xmlns:o="urn:schemas-microsoft-com:office:office" xmlns:oel="http://schemas.microsoft.com/office/2019/extlst" xmlns:r="http://schemas.openxmlformats.org/officeDocument/2006/relationships" xmlns:m="http://schemas.openxmlformats.org/officeDocument/2006/math" xmlns:v="urn:schemas-microsoft-com:vml" xmlns:wp14="http://schemas.microsoft.com/office/word/2010/wordprocessingDrawing" xmlns:wp="http://schemas.openxmlformats.org/drawingml/2006/wordprocessingDrawing" xmlns:w10="urn:schemas-microsoft-com:office:word" xmlns:w="http://schemas.openxmlformats.org/wordprocessingml/2006/main" xmlns:w14="http://schemas.microsoft.com/office/word/2010/wordml" xmlns:w15="http://schemas.microsoft.com/office/word/2012/wordml" xmlns:w16cex="http://schemas.microsoft.com/office/word/2018/wordml/cex" xmlns:w16cid="http://schemas.microsoft.com/office/word/2016/wordml/cid" xmlns:w16="http://schemas.microsoft.com/office/word/2018/wordml" xmlns:w16du="http://schemas.microsoft.com/office/word/2023/wordml/word16du" xmlns:w16sdtdh="http://schemas.microsoft.com/office/word/2020/wordml/sdtdatahash" xmlns:w16sdtfl="http://schemas.microsoft.com/office/word/2024/wordml/sdtformatlock" xmlns:w16se="http://schemas.microsoft.com/office/word/2015/wordml/symex" xmlns:wpg="http://schemas.microsoft.com/office/word/2010/wordprocessingGroup" xmlns:wpi="http://schemas.microsoft.com/office/word/2010/wordprocessingInk" xmlns:wne="http://schemas.microsoft.com/office/word/2006/wordml" xmlns:wps="http://schemas.microsoft.com/office/word/2010/wordprocessingShape" mc:Ignorable="w14 w15 w16se w16cid w16 w16cex w16sdtdh w16sdtfl w16du wp14">
+<w:numbering xmlns:wpc="http://schemas.microsoft.com/office/word/2010/wordprocessingCanvas" xmlns:cx="http://schemas.microsoft.com/office/drawing/2014/chartex" xmlns:cx1="http://schemas.microsoft.com/office/drawing/2015/9/8/chartex" xmlns:cx2="http://schemas.microsoft.com/office/drawing/2015/10/21/chartex" xmlns:cx3="http://schemas.microsoft.com/office/drawing/2016/5/9/chartex" xmlns:cx4="http://schemas.microsoft.com/office/drawing/2016/5/10/chartex" xmlns:cx5="http://schemas.microsoft.com/office/drawing/2016/5/11/chartex" xmlns:cx6="http://schemas.microsoft.com/office/drawing/2016/5/12/chartex" xmlns:cx7="http://schemas.microsoft.com/office/drawing/2016/5/13/chartex" xmlns:cx8="http://schemas.microsoft.com/office/drawing/2016/5/14/chartex" xmlns:mc="http://schemas.openxmlformats.org/markup-compatibility/2006" xmlns:aink="http://schemas.microsoft.com/office/drawing/2016/ink" xmlns:am3d="http://schemas.microsoft.com/office/drawing/2017/model3d" xmlns:o="urn:schemas-microsoft-com:office:office" xmlns:r="http://schemas.openxmlformats.org/officeDocument/2006/relationships" xmlns:m="http://schemas.openxmlformats.org/officeDocument/2006/math" xmlns:v="urn:schemas-microsoft-com:vml" xmlns:wp14="http://schemas.microsoft.com/office/word/2010/wordprocessingDrawing" xmlns:wp="http://schemas.openxmlformats.org/drawingml/2006/wordprocessingDrawing" xmlns:w10="urn:schemas-microsoft-com:office:word" xmlns:w="http://schemas.openxmlformats.org/wordprocessingml/2006/main" xmlns:w14="http://schemas.microsoft.com/office/word/2010/wordml" xmlns:w15="http://schemas.microsoft.com/office/word/2012/wordml" xmlns:w16cex="http://schemas.microsoft.com/office/word/2018/wordml/cex" xmlns:w16cid="http://schemas.microsoft.com/office/word/2016/wordml/cid" xmlns:w16="http://schemas.microsoft.com/office/word/2018/wordml" xmlns:w16sdtdh="http://schemas.microsoft.com/office/word/2020/wordml/sdtdatahash" xmlns:w16se="http://schemas.microsoft.com/office/word/2015/wordml/symex" xmlns:wpg="http://schemas.microsoft.com/office/word/2010/wordprocessingGroup" xmlns:wpi="http://schemas.microsoft.com/office/word/2010/wordprocessingInk" xmlns:wne="http://schemas.microsoft.com/office/word/2006/wordml" xmlns:wps="http://schemas.microsoft.com/office/word/2010/wordprocessingShape" mc:Ignorable="w14 w15 w16se w16cid w16 w16cex w16sdtdh wp14">
   <w:abstractNum w:abstractNumId="0" w15:restartNumberingAfterBreak="0">
     <w:nsid w:val="384152C7"/>
     <w:multiLevelType w:val="multilevel"/>
@@ -7666,17 +7472,17 @@
       </w:rPr>
     </w:lvl>
   </w:abstractNum>
-  <w:num w:numId="1" w16cid:durableId="1939825161">
+  <w:num w:numId="1">
     <w:abstractNumId w:val="1"/>
   </w:num>
-  <w:num w:numId="2" w16cid:durableId="1364359974">
+  <w:num w:numId="2">
     <w:abstractNumId w:val="0"/>
   </w:num>
 </w:numbering>
 </file>
 
 <file path=word/styles.xml><?xml version="1.0" encoding="utf-8"?>
-<w:styles xmlns:mc="http://schemas.openxmlformats.org/markup-compatibility/2006" xmlns:r="http://schemas.openxmlformats.org/officeDocument/2006/relationships" xmlns:w="http://schemas.openxmlformats.org/wordprocessingml/2006/main" xmlns:w14="http://schemas.microsoft.com/office/word/2010/wordml" xmlns:w15="http://schemas.microsoft.com/office/word/2012/wordml" xmlns:w16cex="http://schemas.microsoft.com/office/word/2018/wordml/cex" xmlns:w16cid="http://schemas.microsoft.com/office/word/2016/wordml/cid" xmlns:w16="http://schemas.microsoft.com/office/word/2018/wordml" xmlns:w16du="http://schemas.microsoft.com/office/word/2023/wordml/word16du" xmlns:w16sdtdh="http://schemas.microsoft.com/office/word/2020/wordml/sdtdatahash" xmlns:w16sdtfl="http://schemas.microsoft.com/office/word/2024/wordml/sdtformatlock" xmlns:w16se="http://schemas.microsoft.com/office/word/2015/wordml/symex" mc:Ignorable="w14 w15 w16se w16cid w16 w16cex w16sdtdh w16sdtfl w16du">
+<w:styles xmlns:mc="http://schemas.openxmlformats.org/markup-compatibility/2006" xmlns:r="http://schemas.openxmlformats.org/officeDocument/2006/relationships" xmlns:w="http://schemas.openxmlformats.org/wordprocessingml/2006/main" xmlns:w14="http://schemas.microsoft.com/office/word/2010/wordml" xmlns:w15="http://schemas.microsoft.com/office/word/2012/wordml" xmlns:w16cex="http://schemas.microsoft.com/office/word/2018/wordml/cex" xmlns:w16cid="http://schemas.microsoft.com/office/word/2016/wordml/cid" xmlns:w16="http://schemas.microsoft.com/office/word/2018/wordml" xmlns:w16sdtdh="http://schemas.microsoft.com/office/word/2020/wordml/sdtdatahash" xmlns:w16se="http://schemas.microsoft.com/office/word/2015/wordml/symex" mc:Ignorable="w14 w15 w16se w16cid w16 w16cex w16sdtdh">
   <w:docDefaults>
     <w:rPrDefault>
       <w:rPr>
@@ -8278,6 +8084,7 @@
   <w:style w:type="character" w:default="1" w:styleId="Fuentedeprrafopredeter">
     <w:name w:val="Default Paragraph Font"/>
     <w:uiPriority w:val="1"/>
+    <w:semiHidden/>
     <w:unhideWhenUsed/>
   </w:style>
   <w:style w:type="table" w:default="1" w:styleId="Tablanormal">

</xml_diff>